<commit_message>
Tina Parte 2: revisão
Co-Authored-By: Claude Opus 5.5 <noreply@anthropic.com>
Claude-Session: https://claude.ai/code/session_01MJjUEEZrxQDEUifKK2vj9g
</commit_message>
<xml_diff>
--- a/roteiros/tina-turner/Tina_Parte2.docx
+++ b/roteiros/tina-turner/Tina_Parte2.docx
@@ -159,7 +159,7 @@
         <w:rPr>
           <w:color w:val="000000"/>
         </w:rPr>
-        <w:t>O estúdio já estava pago. Ike precisava de uma voz.</w:t>
+        <w:t>Ike precisava de alguém para gravar.</w:t>
       </w:r>
     </w:p>
     <w:p>
@@ -383,7 +383,7 @@
         <w:rPr>
           <w:color w:val="000000"/>
         </w:rPr>
-        <w:t>O casamento foi em Tijuana, no México, do outro lado da fronteira. Uma cerimônia rápida, longe de qualquer festa.</w:t>
+        <w:t>O casamento foi em Tijuana, no México, do outro lado da fronteira.</w:t>
       </w:r>
     </w:p>
     <w:p>

</xml_diff>